<commit_message>
Revert result-certificate docx template to placeholder version
The template's example rows were overwritten with real data in the
previous commit, breaking certificate.js's hardcoded placeholder
matching (글로웰시스템/김철수/김미영/89) and row-count assumption,
which crashed certificate downloads with "Cannot read properties of
undefined (reading '1')".
</commit_message>
<xml_diff>
--- a/server/templates/2026년_05월_정기평가_결과안내_글로웰시스템.docx
+++ b/server/templates/2026년_05월_정기평가_결과안내_글로웰시스템.docx
@@ -4,15 +4,43 @@
   <w:body>
     <w:p>
       <w:r>
-        <w:t xml:space="preserve">안녕하세요 </w:t>
+        <w:t>안녕하세요</w:t>
+      </w:r>
+      <w:r>
+        <w:t xml:space="preserve"> </w:t>
       </w:r>
       <w:r>
         <w:br/>
       </w:r>
     </w:p>
     <w:p>
-      <w:r>
-        <w:t>지니언스(주) 솔루션기술센터 입니다.</w:t>
+      <w:proofErr w:type="spellStart"/>
+      <w:r>
+        <w:t>지니언스</w:t>
+      </w:r>
+      <w:proofErr w:type="spellEnd"/>
+      <w:r>
+        <w:t>(</w:t>
+      </w:r>
+      <w:r>
+        <w:t>주</w:t>
+      </w:r>
+      <w:r>
+        <w:t xml:space="preserve">) </w:t>
+      </w:r>
+      <w:proofErr w:type="gramStart"/>
+      <w:r>
+        <w:t>솔루션기술센터</w:t>
+      </w:r>
+      <w:r>
+        <w:t xml:space="preserve"> </w:t>
+      </w:r>
+      <w:r>
+        <w:t>입니다</w:t>
+      </w:r>
+      <w:proofErr w:type="gramEnd"/>
+      <w:r>
+        <w:t>.</w:t>
       </w:r>
     </w:p>
     <w:p/>
@@ -21,13 +49,34 @@
         <w:spacing w:after="200"/>
       </w:pPr>
       <w:r>
-        <w:t>2026년 0</w:t>
-      </w:r>
-      <w:r>
-        <w:t>6</w:t>
-      </w:r>
-      <w:r>
-        <w:t>월 정기평가 결과 안내</w:t>
+        <w:t>2026</w:t>
+      </w:r>
+      <w:r>
+        <w:t>년</w:t>
+      </w:r>
+      <w:r>
+        <w:t xml:space="preserve"> 05</w:t>
+      </w:r>
+      <w:r>
+        <w:t>월</w:t>
+      </w:r>
+      <w:r>
+        <w:t xml:space="preserve"> </w:t>
+      </w:r>
+      <w:r>
+        <w:t>정기평가</w:t>
+      </w:r>
+      <w:r>
+        <w:t xml:space="preserve"> </w:t>
+      </w:r>
+      <w:r>
+        <w:t>결과</w:t>
+      </w:r>
+      <w:r>
+        <w:t xml:space="preserve"> </w:t>
+      </w:r>
+      <w:r>
+        <w:t>안내</w:t>
       </w:r>
       <w:r>
         <w:rPr>
@@ -36,7 +85,10 @@
         <w:t xml:space="preserve"> </w:t>
       </w:r>
       <w:r>
-        <w:t xml:space="preserve">드립니다. </w:t>
+        <w:t>드립니다</w:t>
+      </w:r>
+      <w:r>
+        <w:t xml:space="preserve">. </w:t>
       </w:r>
     </w:p>
     <w:p>
@@ -44,7 +96,60 @@
         <w:spacing w:after="200"/>
       </w:pPr>
       <w:r>
-        <w:t>합격 기준은 평가점수(만점100) 60점 이상인 분만 해당 됩니다.</w:t>
+        <w:t>합격</w:t>
+      </w:r>
+      <w:r>
+        <w:t xml:space="preserve"> </w:t>
+      </w:r>
+      <w:r>
+        <w:t>기준은</w:t>
+      </w:r>
+      <w:r>
+        <w:t xml:space="preserve"> </w:t>
+      </w:r>
+      <w:r>
+        <w:t>평가점수</w:t>
+      </w:r>
+      <w:r>
+        <w:t>(</w:t>
+      </w:r>
+      <w:r>
+        <w:t>만점</w:t>
+      </w:r>
+      <w:r>
+        <w:t>100) 60</w:t>
+      </w:r>
+      <w:r>
+        <w:t>점</w:t>
+      </w:r>
+      <w:r>
+        <w:t xml:space="preserve"> </w:t>
+      </w:r>
+      <w:r>
+        <w:t>이상인</w:t>
+      </w:r>
+      <w:r>
+        <w:t xml:space="preserve"> </w:t>
+      </w:r>
+      <w:r>
+        <w:t>분만</w:t>
+      </w:r>
+      <w:r>
+        <w:t xml:space="preserve"> </w:t>
+      </w:r>
+      <w:proofErr w:type="gramStart"/>
+      <w:r>
+        <w:t>해당</w:t>
+      </w:r>
+      <w:r>
+        <w:t xml:space="preserve"> </w:t>
+      </w:r>
+      <w:r>
+        <w:t>됩니다</w:t>
+      </w:r>
+      <w:proofErr w:type="gramEnd"/>
+      <w:r>
+        <w:t>.</w:t>
       </w:r>
     </w:p>
     <w:tbl>
@@ -72,6 +177,12 @@
         <w:gridCol w:w="1575"/>
       </w:tblGrid>
       <w:tr>
+        <w:tblPrEx>
+          <w:tblCellMar>
+            <w:top w:w="0" w:type="dxa"/>
+            <w:bottom w:w="0" w:type="dxa"/>
+          </w:tblCellMar>
+        </w:tblPrEx>
         <w:tc>
           <w:tcPr>
             <w:tcW w:w="1740" w:type="dxa"/>
@@ -224,6 +335,12 @@
         </w:tc>
       </w:tr>
       <w:tr>
+        <w:tblPrEx>
+          <w:tblCellMar>
+            <w:top w:w="0" w:type="dxa"/>
+            <w:bottom w:w="0" w:type="dxa"/>
+          </w:tblCellMar>
+        </w:tblPrEx>
         <w:tc>
           <w:tcPr>
             <w:tcW w:w="1740" w:type="dxa"/>
@@ -244,12 +361,11 @@
             <w:pPr>
               <w:jc w:val="center"/>
             </w:pPr>
+            <w:proofErr w:type="spellStart"/>
             <w:r>
-              <w:rPr>
-                <w:rFonts w:hint="eastAsia"/>
-              </w:rPr>
-              <w:t>구루앤</w:t>
+              <w:t>글로웰시스템</w:t>
             </w:r>
+            <w:proofErr w:type="spellEnd"/>
           </w:p>
         </w:tc>
         <w:tc>
@@ -273,10 +389,7 @@
               <w:jc w:val="center"/>
             </w:pPr>
             <w:r>
-              <w:rPr>
-                <w:rFonts w:hint="eastAsia"/>
-              </w:rPr>
-              <w:t>배범한</w:t>
+              <w:t>김철수</w:t>
             </w:r>
           </w:p>
         </w:tc>
@@ -301,12 +414,9 @@
               <w:jc w:val="center"/>
             </w:pPr>
             <w:r>
-              <w:t xml:space="preserve">EDR </w:t>
+              <w:t xml:space="preserve">NAC </w:t>
             </w:r>
             <w:r>
-              <w:rPr>
-                <w:rFonts w:hint="eastAsia"/>
-              </w:rPr>
               <w:t>초급</w:t>
             </w:r>
           </w:p>
@@ -332,7 +442,7 @@
               <w:jc w:val="center"/>
             </w:pPr>
             <w:r>
-              <w:t>98</w:t>
+              <w:t>89</w:t>
             </w:r>
           </w:p>
         </w:tc>
@@ -367,6 +477,149 @@
           </w:p>
         </w:tc>
       </w:tr>
+      <w:tr>
+        <w:tblPrEx>
+          <w:tblCellMar>
+            <w:top w:w="0" w:type="dxa"/>
+            <w:bottom w:w="0" w:type="dxa"/>
+          </w:tblCellMar>
+        </w:tblPrEx>
+        <w:tc>
+          <w:tcPr>
+            <w:tcW w:w="1740" w:type="dxa"/>
+            <w:tcBorders>
+              <w:top w:val="single" w:sz="4" w:space="0" w:color="000000"/>
+              <w:left w:val="single" w:sz="4" w:space="0" w:color="000000"/>
+              <w:bottom w:val="single" w:sz="4" w:space="0" w:color="000000"/>
+              <w:right w:val="single" w:sz="4" w:space="0" w:color="000000"/>
+            </w:tcBorders>
+            <w:tcMar>
+              <w:top w:w="80" w:type="dxa"/>
+              <w:left w:w="100" w:type="dxa"/>
+              <w:bottom w:w="80" w:type="dxa"/>
+              <w:right w:w="100" w:type="dxa"/>
+            </w:tcMar>
+          </w:tcPr>
+          <w:p>
+            <w:pPr>
+              <w:jc w:val="center"/>
+            </w:pPr>
+            <w:proofErr w:type="spellStart"/>
+            <w:r>
+              <w:t>글로웰시스템</w:t>
+            </w:r>
+            <w:proofErr w:type="spellEnd"/>
+          </w:p>
+        </w:tc>
+        <w:tc>
+          <w:tcPr>
+            <w:tcW w:w="1500" w:type="dxa"/>
+            <w:tcBorders>
+              <w:top w:val="single" w:sz="4" w:space="0" w:color="000000"/>
+              <w:left w:val="single" w:sz="4" w:space="0" w:color="000000"/>
+              <w:bottom w:val="single" w:sz="4" w:space="0" w:color="000000"/>
+              <w:right w:val="single" w:sz="4" w:space="0" w:color="000000"/>
+            </w:tcBorders>
+            <w:tcMar>
+              <w:top w:w="80" w:type="dxa"/>
+              <w:left w:w="100" w:type="dxa"/>
+              <w:bottom w:w="80" w:type="dxa"/>
+              <w:right w:w="100" w:type="dxa"/>
+            </w:tcMar>
+          </w:tcPr>
+          <w:p>
+            <w:pPr>
+              <w:jc w:val="center"/>
+            </w:pPr>
+            <w:r>
+              <w:t>김미영</w:t>
+            </w:r>
+          </w:p>
+        </w:tc>
+        <w:tc>
+          <w:tcPr>
+            <w:tcW w:w="1890" w:type="dxa"/>
+            <w:tcBorders>
+              <w:top w:val="single" w:sz="4" w:space="0" w:color="000000"/>
+              <w:left w:val="single" w:sz="4" w:space="0" w:color="000000"/>
+              <w:bottom w:val="single" w:sz="4" w:space="0" w:color="000000"/>
+              <w:right w:val="single" w:sz="4" w:space="0" w:color="000000"/>
+            </w:tcBorders>
+            <w:tcMar>
+              <w:top w:w="80" w:type="dxa"/>
+              <w:left w:w="100" w:type="dxa"/>
+              <w:bottom w:w="80" w:type="dxa"/>
+              <w:right w:w="100" w:type="dxa"/>
+            </w:tcMar>
+          </w:tcPr>
+          <w:p>
+            <w:pPr>
+              <w:jc w:val="center"/>
+            </w:pPr>
+            <w:r>
+              <w:t xml:space="preserve">NAC </w:t>
+            </w:r>
+            <w:r>
+              <w:t>초급</w:t>
+            </w:r>
+          </w:p>
+        </w:tc>
+        <w:tc>
+          <w:tcPr>
+            <w:tcW w:w="1125" w:type="dxa"/>
+            <w:tcBorders>
+              <w:top w:val="single" w:sz="4" w:space="0" w:color="000000"/>
+              <w:left w:val="single" w:sz="4" w:space="0" w:color="000000"/>
+              <w:bottom w:val="single" w:sz="4" w:space="0" w:color="000000"/>
+              <w:right w:val="single" w:sz="4" w:space="0" w:color="000000"/>
+            </w:tcBorders>
+            <w:tcMar>
+              <w:top w:w="80" w:type="dxa"/>
+              <w:left w:w="100" w:type="dxa"/>
+              <w:bottom w:w="80" w:type="dxa"/>
+              <w:right w:w="100" w:type="dxa"/>
+            </w:tcMar>
+          </w:tcPr>
+          <w:p>
+            <w:pPr>
+              <w:jc w:val="center"/>
+            </w:pPr>
+            <w:r>
+              <w:t>40</w:t>
+            </w:r>
+          </w:p>
+        </w:tc>
+        <w:tc>
+          <w:tcPr>
+            <w:tcW w:w="1575" w:type="dxa"/>
+            <w:tcBorders>
+              <w:top w:val="single" w:sz="4" w:space="0" w:color="000000"/>
+              <w:left w:val="single" w:sz="4" w:space="0" w:color="000000"/>
+              <w:bottom w:val="single" w:sz="4" w:space="0" w:color="000000"/>
+              <w:right w:val="single" w:sz="4" w:space="0" w:color="000000"/>
+            </w:tcBorders>
+            <w:tcMar>
+              <w:top w:w="80" w:type="dxa"/>
+              <w:left w:w="100" w:type="dxa"/>
+              <w:bottom w:w="80" w:type="dxa"/>
+              <w:right w:w="100" w:type="dxa"/>
+            </w:tcMar>
+          </w:tcPr>
+          <w:p>
+            <w:pPr>
+              <w:jc w:val="center"/>
+            </w:pPr>
+            <w:r>
+              <w:rPr>
+                <w:b/>
+                <w:bCs/>
+                <w:color w:val="C00000"/>
+              </w:rPr>
+              <w:t>불합격</w:t>
+            </w:r>
+          </w:p>
+        </w:tc>
+      </w:tr>
     </w:tbl>
     <w:p>
       <w:pPr>
@@ -379,7 +632,98 @@
           <w:b/>
           <w:bCs/>
         </w:rPr>
-        <w:t xml:space="preserve">이슈관리시스템(JIRA) 계정은 정기평가 신청에 기입해주신 1,2,3 지망으로 생성되며, </w:t>
+        <w:t>이슈관리시스템</w:t>
+      </w:r>
+      <w:r>
+        <w:rPr>
+          <w:b/>
+          <w:bCs/>
+        </w:rPr>
+        <w:t xml:space="preserve">(JIRA) </w:t>
+      </w:r>
+      <w:r>
+        <w:rPr>
+          <w:b/>
+          <w:bCs/>
+        </w:rPr>
+        <w:t>계정은</w:t>
+      </w:r>
+      <w:r>
+        <w:rPr>
+          <w:b/>
+          <w:bCs/>
+        </w:rPr>
+        <w:t xml:space="preserve"> </w:t>
+      </w:r>
+      <w:r>
+        <w:rPr>
+          <w:b/>
+          <w:bCs/>
+        </w:rPr>
+        <w:t>정기평가</w:t>
+      </w:r>
+      <w:r>
+        <w:rPr>
+          <w:b/>
+          <w:bCs/>
+        </w:rPr>
+        <w:t xml:space="preserve"> </w:t>
+      </w:r>
+      <w:r>
+        <w:rPr>
+          <w:b/>
+          <w:bCs/>
+        </w:rPr>
+        <w:t>신청에</w:t>
+      </w:r>
+      <w:r>
+        <w:rPr>
+          <w:b/>
+          <w:bCs/>
+        </w:rPr>
+        <w:t xml:space="preserve"> </w:t>
+      </w:r>
+      <w:r>
+        <w:rPr>
+          <w:b/>
+          <w:bCs/>
+        </w:rPr>
+        <w:t>기입해주신</w:t>
+      </w:r>
+      <w:r>
+        <w:rPr>
+          <w:b/>
+          <w:bCs/>
+        </w:rPr>
+        <w:t xml:space="preserve"> 1,2,3 </w:t>
+      </w:r>
+      <w:r>
+        <w:rPr>
+          <w:b/>
+          <w:bCs/>
+        </w:rPr>
+        <w:t>지망으로</w:t>
+      </w:r>
+      <w:r>
+        <w:rPr>
+          <w:b/>
+          <w:bCs/>
+        </w:rPr>
+        <w:t xml:space="preserve"> </w:t>
+      </w:r>
+      <w:r>
+        <w:rPr>
+          <w:b/>
+          <w:bCs/>
+        </w:rPr>
+        <w:t>생성되며</w:t>
+      </w:r>
+      <w:r>
+        <w:rPr>
+          <w:b/>
+          <w:bCs/>
+        </w:rPr>
+        <w:t xml:space="preserve">, </w:t>
       </w:r>
       <w:r>
         <w:rPr>
@@ -388,20 +732,150 @@
         </w:rPr>
         <w:br/>
       </w:r>
-      <w:r>
-        <w:rPr>
-          <w:b/>
-          <w:bCs/>
-          <w:u w:val="single"/>
-        </w:rPr>
-        <w:t>초기패스워드는 본 메시지 안내일 SMS를 통해 개별 전달</w:t>
-      </w:r>
-      <w:r>
-        <w:rPr>
-          <w:b/>
-          <w:bCs/>
-        </w:rPr>
-        <w:t xml:space="preserve"> 됩니다. </w:t>
+      <w:proofErr w:type="spellStart"/>
+      <w:r>
+        <w:rPr>
+          <w:b/>
+          <w:bCs/>
+          <w:u w:val="single"/>
+        </w:rPr>
+        <w:t>초기패스워드는</w:t>
+      </w:r>
+      <w:proofErr w:type="spellEnd"/>
+      <w:r>
+        <w:rPr>
+          <w:b/>
+          <w:bCs/>
+          <w:u w:val="single"/>
+        </w:rPr>
+        <w:t xml:space="preserve"> </w:t>
+      </w:r>
+      <w:r>
+        <w:rPr>
+          <w:b/>
+          <w:bCs/>
+          <w:u w:val="single"/>
+        </w:rPr>
+        <w:t>본</w:t>
+      </w:r>
+      <w:r>
+        <w:rPr>
+          <w:b/>
+          <w:bCs/>
+          <w:u w:val="single"/>
+        </w:rPr>
+        <w:t xml:space="preserve"> </w:t>
+      </w:r>
+      <w:r>
+        <w:rPr>
+          <w:b/>
+          <w:bCs/>
+          <w:u w:val="single"/>
+        </w:rPr>
+        <w:t>메시지</w:t>
+      </w:r>
+      <w:r>
+        <w:rPr>
+          <w:b/>
+          <w:bCs/>
+          <w:u w:val="single"/>
+        </w:rPr>
+        <w:t xml:space="preserve"> </w:t>
+      </w:r>
+      <w:r>
+        <w:rPr>
+          <w:b/>
+          <w:bCs/>
+          <w:u w:val="single"/>
+        </w:rPr>
+        <w:t>안내일</w:t>
+      </w:r>
+      <w:r>
+        <w:rPr>
+          <w:b/>
+          <w:bCs/>
+          <w:u w:val="single"/>
+        </w:rPr>
+        <w:t xml:space="preserve"> SMS</w:t>
+      </w:r>
+      <w:r>
+        <w:rPr>
+          <w:b/>
+          <w:bCs/>
+          <w:u w:val="single"/>
+        </w:rPr>
+        <w:t>를</w:t>
+      </w:r>
+      <w:r>
+        <w:rPr>
+          <w:b/>
+          <w:bCs/>
+          <w:u w:val="single"/>
+        </w:rPr>
+        <w:t xml:space="preserve"> </w:t>
+      </w:r>
+      <w:r>
+        <w:rPr>
+          <w:b/>
+          <w:bCs/>
+          <w:u w:val="single"/>
+        </w:rPr>
+        <w:t>통해</w:t>
+      </w:r>
+      <w:r>
+        <w:rPr>
+          <w:b/>
+          <w:bCs/>
+          <w:u w:val="single"/>
+        </w:rPr>
+        <w:t xml:space="preserve"> </w:t>
+      </w:r>
+      <w:r>
+        <w:rPr>
+          <w:b/>
+          <w:bCs/>
+          <w:u w:val="single"/>
+        </w:rPr>
+        <w:t>개별</w:t>
+      </w:r>
+      <w:r>
+        <w:rPr>
+          <w:b/>
+          <w:bCs/>
+          <w:u w:val="single"/>
+        </w:rPr>
+        <w:t xml:space="preserve"> </w:t>
+      </w:r>
+      <w:proofErr w:type="gramStart"/>
+      <w:r>
+        <w:rPr>
+          <w:b/>
+          <w:bCs/>
+          <w:u w:val="single"/>
+        </w:rPr>
+        <w:t>전달</w:t>
+      </w:r>
+      <w:r>
+        <w:rPr>
+          <w:b/>
+          <w:bCs/>
+        </w:rPr>
+        <w:t xml:space="preserve"> </w:t>
+      </w:r>
+      <w:r>
+        <w:rPr>
+          <w:b/>
+          <w:bCs/>
+        </w:rPr>
+        <w:t>됩니다</w:t>
+      </w:r>
+      <w:proofErr w:type="gramEnd"/>
+      <w:r>
+        <w:rPr>
+          <w:b/>
+          <w:bCs/>
+        </w:rPr>
+        <w:t xml:space="preserve">. </w:t>
       </w:r>
     </w:p>
     <w:p>
@@ -413,17 +887,99 @@
         </w:numPr>
       </w:pPr>
       <w:r>
-        <w:t xml:space="preserve">이미 계정이 발급되어 있으신분은 </w:t>
-      </w:r>
-      <w:r>
-        <w:rPr>
-          <w:b/>
-          <w:bCs/>
-        </w:rPr>
-        <w:t>라이선스 재활성화 또는 등급이 갱신</w:t>
-      </w:r>
-      <w:r>
-        <w:t>됩니다.</w:t>
+        <w:t>이미</w:t>
+      </w:r>
+      <w:r>
+        <w:t xml:space="preserve"> </w:t>
+      </w:r>
+      <w:r>
+        <w:t>계정이</w:t>
+      </w:r>
+      <w:r>
+        <w:t xml:space="preserve"> </w:t>
+      </w:r>
+      <w:r>
+        <w:t>발급되어</w:t>
+      </w:r>
+      <w:r>
+        <w:t xml:space="preserve"> </w:t>
+      </w:r>
+      <w:proofErr w:type="spellStart"/>
+      <w:r>
+        <w:t>있으신분은</w:t>
+      </w:r>
+      <w:proofErr w:type="spellEnd"/>
+      <w:r>
+        <w:t xml:space="preserve"> </w:t>
+      </w:r>
+      <w:r>
+        <w:rPr>
+          <w:b/>
+          <w:bCs/>
+        </w:rPr>
+        <w:t>라이선스</w:t>
+      </w:r>
+      <w:r>
+        <w:rPr>
+          <w:b/>
+          <w:bCs/>
+        </w:rPr>
+        <w:t xml:space="preserve"> </w:t>
+      </w:r>
+      <w:r>
+        <w:rPr>
+          <w:b/>
+          <w:bCs/>
+        </w:rPr>
+        <w:t>재활성화</w:t>
+      </w:r>
+      <w:r>
+        <w:rPr>
+          <w:b/>
+          <w:bCs/>
+        </w:rPr>
+        <w:t xml:space="preserve"> </w:t>
+      </w:r>
+      <w:r>
+        <w:rPr>
+          <w:b/>
+          <w:bCs/>
+        </w:rPr>
+        <w:t>또는</w:t>
+      </w:r>
+      <w:r>
+        <w:rPr>
+          <w:b/>
+          <w:bCs/>
+        </w:rPr>
+        <w:t xml:space="preserve"> </w:t>
+      </w:r>
+      <w:r>
+        <w:rPr>
+          <w:b/>
+          <w:bCs/>
+        </w:rPr>
+        <w:t>등급이</w:t>
+      </w:r>
+      <w:r>
+        <w:rPr>
+          <w:b/>
+          <w:bCs/>
+        </w:rPr>
+        <w:t xml:space="preserve"> </w:t>
+      </w:r>
+      <w:r>
+        <w:rPr>
+          <w:b/>
+          <w:bCs/>
+        </w:rPr>
+        <w:t>갱신</w:t>
+      </w:r>
+      <w:r>
+        <w:t>됩니다</w:t>
+      </w:r>
+      <w:r>
+        <w:t>.</w:t>
       </w:r>
     </w:p>
     <w:p>
@@ -434,14 +990,39 @@
           <w:numId w:val="2"/>
         </w:numPr>
       </w:pPr>
-      <w:r>
-        <w:t>Conflu</w:t>
-      </w:r>
-      <w:r>
-        <w:t>e</w:t>
-      </w:r>
-      <w:r>
-        <w:t>nce KB 접근 권한이 추가 됩니다.</w:t>
+      <w:proofErr w:type="spellStart"/>
+      <w:r>
+        <w:t>Conflunce</w:t>
+      </w:r>
+      <w:proofErr w:type="spellEnd"/>
+      <w:r>
+        <w:t xml:space="preserve"> KB </w:t>
+      </w:r>
+      <w:r>
+        <w:t>접근</w:t>
+      </w:r>
+      <w:r>
+        <w:t xml:space="preserve"> </w:t>
+      </w:r>
+      <w:r>
+        <w:t>권한이</w:t>
+      </w:r>
+      <w:r>
+        <w:t xml:space="preserve"> </w:t>
+      </w:r>
+      <w:proofErr w:type="gramStart"/>
+      <w:r>
+        <w:t>추가</w:t>
+      </w:r>
+      <w:r>
+        <w:t xml:space="preserve"> </w:t>
+      </w:r>
+      <w:r>
+        <w:t>됩니다</w:t>
+      </w:r>
+      <w:proofErr w:type="gramEnd"/>
+      <w:r>
+        <w:t>.</w:t>
       </w:r>
     </w:p>
     <w:p>
@@ -453,13 +1034,116 @@
         </w:numPr>
         <w:spacing w:after="200"/>
       </w:pPr>
-      <w:r>
-        <w:t>Genian Slack 채널에 참여하실 수 있습니다.(대상 : PR파트너사, 초대메일발송)</w:t>
+      <w:proofErr w:type="spellStart"/>
+      <w:r>
+        <w:t>Genian</w:t>
+      </w:r>
+      <w:proofErr w:type="spellEnd"/>
+      <w:r>
+        <w:t xml:space="preserve"> Slack </w:t>
+      </w:r>
+      <w:r>
+        <w:t>채널에</w:t>
+      </w:r>
+      <w:r>
+        <w:t xml:space="preserve"> </w:t>
+      </w:r>
+      <w:r>
+        <w:t>참여하실</w:t>
+      </w:r>
+      <w:r>
+        <w:t xml:space="preserve"> </w:t>
+      </w:r>
+      <w:r>
+        <w:t>수</w:t>
+      </w:r>
+      <w:r>
+        <w:t xml:space="preserve"> </w:t>
+      </w:r>
+      <w:proofErr w:type="gramStart"/>
+      <w:r>
+        <w:t>있습니다</w:t>
+      </w:r>
+      <w:r>
+        <w:t>.(</w:t>
+      </w:r>
+      <w:proofErr w:type="gramEnd"/>
+      <w:r>
+        <w:t>대상</w:t>
+      </w:r>
+      <w:r>
+        <w:t xml:space="preserve"> : PR</w:t>
+      </w:r>
+      <w:r>
+        <w:t>파트너사</w:t>
+      </w:r>
+      <w:r>
+        <w:t xml:space="preserve">, </w:t>
+      </w:r>
+      <w:r>
+        <w:t>초대메일발송</w:t>
+      </w:r>
+      <w:r>
+        <w:t>)</w:t>
       </w:r>
     </w:p>
     <w:p>
       <w:r>
-        <w:t>1. 발급된 계정은 개인별로 발급되었으니 개별적인 사용과 관리를 권고 드립니다.</w:t>
+        <w:t xml:space="preserve">1. </w:t>
+      </w:r>
+      <w:r>
+        <w:t>발급된</w:t>
+      </w:r>
+      <w:r>
+        <w:t xml:space="preserve"> </w:t>
+      </w:r>
+      <w:r>
+        <w:t>계정은</w:t>
+      </w:r>
+      <w:r>
+        <w:t xml:space="preserve"> </w:t>
+      </w:r>
+      <w:r>
+        <w:t>개인별로</w:t>
+      </w:r>
+      <w:r>
+        <w:t xml:space="preserve"> </w:t>
+      </w:r>
+      <w:r>
+        <w:t>발급되었으니</w:t>
+      </w:r>
+      <w:r>
+        <w:t xml:space="preserve"> </w:t>
+      </w:r>
+      <w:r>
+        <w:t>개별적인</w:t>
+      </w:r>
+      <w:r>
+        <w:t xml:space="preserve"> </w:t>
+      </w:r>
+      <w:r>
+        <w:t>사용과</w:t>
+      </w:r>
+      <w:r>
+        <w:t xml:space="preserve"> </w:t>
+      </w:r>
+      <w:r>
+        <w:t>관리를</w:t>
+      </w:r>
+      <w:r>
+        <w:t xml:space="preserve"> </w:t>
+      </w:r>
+      <w:r>
+        <w:t>권고</w:t>
+      </w:r>
+      <w:r>
+        <w:t xml:space="preserve"> </w:t>
+      </w:r>
+      <w:r>
+        <w:t>드립니다</w:t>
+      </w:r>
+      <w:r>
+        <w:t>.</w:t>
       </w:r>
     </w:p>
     <w:p>
@@ -468,16 +1152,65 @@
         <w:ind w:left="200"/>
       </w:pPr>
       <w:r>
-        <w:t>- JIRA ID 엔지니어 공유 금지 및 공유</w:t>
-      </w:r>
-      <w:r>
-        <w:rPr>
-          <w:rFonts w:hint="eastAsia"/>
-        </w:rPr>
-        <w:t xml:space="preserve"> </w:t>
-      </w:r>
-      <w:r>
-        <w:t>시 지원 불가하오니 유의하시기 바랍니다.</w:t>
+        <w:t xml:space="preserve">- JIRA ID </w:t>
+      </w:r>
+      <w:r>
+        <w:t>엔지니어</w:t>
+      </w:r>
+      <w:r>
+        <w:t xml:space="preserve"> </w:t>
+      </w:r>
+      <w:r>
+        <w:t>공유</w:t>
+      </w:r>
+      <w:r>
+        <w:t xml:space="preserve"> </w:t>
+      </w:r>
+      <w:r>
+        <w:t>금지</w:t>
+      </w:r>
+      <w:r>
+        <w:t xml:space="preserve"> </w:t>
+      </w:r>
+      <w:r>
+        <w:t>및</w:t>
+      </w:r>
+      <w:r>
+        <w:t xml:space="preserve"> </w:t>
+      </w:r>
+      <w:proofErr w:type="spellStart"/>
+      <w:r>
+        <w:t>공유시</w:t>
+      </w:r>
+      <w:proofErr w:type="spellEnd"/>
+      <w:r>
+        <w:t xml:space="preserve"> </w:t>
+      </w:r>
+      <w:r>
+        <w:t>지원</w:t>
+      </w:r>
+      <w:r>
+        <w:t xml:space="preserve"> </w:t>
+      </w:r>
+      <w:proofErr w:type="spellStart"/>
+      <w:r>
+        <w:t>불가하오니</w:t>
+      </w:r>
+      <w:proofErr w:type="spellEnd"/>
+      <w:r>
+        <w:t xml:space="preserve"> </w:t>
+      </w:r>
+      <w:r>
+        <w:t>유의하시기</w:t>
+      </w:r>
+      <w:r>
+        <w:t xml:space="preserve"> </w:t>
+      </w:r>
+      <w:r>
+        <w:t>바랍니다</w:t>
+      </w:r>
+      <w:r>
+        <w:t>.</w:t>
       </w:r>
     </w:p>
     <w:p>
@@ -493,10 +1226,195 @@
           <w:bCs/>
           <w:u w:val="single"/>
         </w:rPr>
-        <w:t>초기 비밀번호는 최초접속 후 반드시 비밀번호를 변경</w:t>
-      </w:r>
-      <w:r>
-        <w:t>해주시기 바라며, 변경하지 않는 경우, 발급 취소 (InActive 상태로 변경) 될 수 있음을 유의하시기 바랍니다.</w:t>
+        <w:t>초기</w:t>
+      </w:r>
+      <w:r>
+        <w:rPr>
+          <w:b/>
+          <w:bCs/>
+          <w:u w:val="single"/>
+        </w:rPr>
+        <w:t xml:space="preserve"> </w:t>
+      </w:r>
+      <w:r>
+        <w:rPr>
+          <w:b/>
+          <w:bCs/>
+          <w:u w:val="single"/>
+        </w:rPr>
+        <w:t>비밀번호는</w:t>
+      </w:r>
+      <w:r>
+        <w:rPr>
+          <w:b/>
+          <w:bCs/>
+          <w:u w:val="single"/>
+        </w:rPr>
+        <w:t xml:space="preserve"> </w:t>
+      </w:r>
+      <w:r>
+        <w:rPr>
+          <w:b/>
+          <w:bCs/>
+          <w:u w:val="single"/>
+        </w:rPr>
+        <w:t>최초접속</w:t>
+      </w:r>
+      <w:r>
+        <w:rPr>
+          <w:b/>
+          <w:bCs/>
+          <w:u w:val="single"/>
+        </w:rPr>
+        <w:t xml:space="preserve"> </w:t>
+      </w:r>
+      <w:r>
+        <w:rPr>
+          <w:b/>
+          <w:bCs/>
+          <w:u w:val="single"/>
+        </w:rPr>
+        <w:t>후</w:t>
+      </w:r>
+      <w:r>
+        <w:rPr>
+          <w:b/>
+          <w:bCs/>
+          <w:u w:val="single"/>
+        </w:rPr>
+        <w:t xml:space="preserve"> </w:t>
+      </w:r>
+      <w:r>
+        <w:rPr>
+          <w:b/>
+          <w:bCs/>
+          <w:u w:val="single"/>
+        </w:rPr>
+        <w:t>반드시</w:t>
+      </w:r>
+      <w:r>
+        <w:rPr>
+          <w:b/>
+          <w:bCs/>
+          <w:u w:val="single"/>
+        </w:rPr>
+        <w:t xml:space="preserve"> </w:t>
+      </w:r>
+      <w:r>
+        <w:rPr>
+          <w:b/>
+          <w:bCs/>
+          <w:u w:val="single"/>
+        </w:rPr>
+        <w:t>비밀번호를</w:t>
+      </w:r>
+      <w:r>
+        <w:rPr>
+          <w:b/>
+          <w:bCs/>
+          <w:u w:val="single"/>
+        </w:rPr>
+        <w:t xml:space="preserve"> </w:t>
+      </w:r>
+      <w:r>
+        <w:rPr>
+          <w:b/>
+          <w:bCs/>
+          <w:u w:val="single"/>
+        </w:rPr>
+        <w:t>변경</w:t>
+      </w:r>
+      <w:r>
+        <w:t>해주시기</w:t>
+      </w:r>
+      <w:r>
+        <w:t xml:space="preserve"> </w:t>
+      </w:r>
+      <w:r>
+        <w:t>바라며</w:t>
+      </w:r>
+      <w:r>
+        <w:t xml:space="preserve">, </w:t>
+      </w:r>
+      <w:r>
+        <w:t>변경하지</w:t>
+      </w:r>
+      <w:r>
+        <w:t xml:space="preserve"> </w:t>
+      </w:r>
+      <w:r>
+        <w:t>않는</w:t>
+      </w:r>
+      <w:r>
+        <w:t xml:space="preserve"> </w:t>
+      </w:r>
+      <w:r>
+        <w:t>경우</w:t>
+      </w:r>
+      <w:r>
+        <w:t xml:space="preserve">, </w:t>
+      </w:r>
+      <w:r>
+        <w:t>발급</w:t>
+      </w:r>
+      <w:r>
+        <w:t xml:space="preserve"> </w:t>
+      </w:r>
+      <w:r>
+        <w:t>취소</w:t>
+      </w:r>
+      <w:r>
+        <w:t xml:space="preserve"> (</w:t>
+      </w:r>
+      <w:proofErr w:type="spellStart"/>
+      <w:r>
+        <w:t>InActive</w:t>
+      </w:r>
+      <w:proofErr w:type="spellEnd"/>
+      <w:r>
+        <w:t xml:space="preserve"> </w:t>
+      </w:r>
+      <w:r>
+        <w:t>상태로</w:t>
+      </w:r>
+      <w:r>
+        <w:t xml:space="preserve"> </w:t>
+      </w:r>
+      <w:r>
+        <w:t>변경</w:t>
+      </w:r>
+      <w:r>
+        <w:t xml:space="preserve">) </w:t>
+      </w:r>
+      <w:r>
+        <w:t>될</w:t>
+      </w:r>
+      <w:r>
+        <w:t xml:space="preserve"> </w:t>
+      </w:r>
+      <w:r>
+        <w:t>수</w:t>
+      </w:r>
+      <w:r>
+        <w:t xml:space="preserve"> </w:t>
+      </w:r>
+      <w:r>
+        <w:t>있음을</w:t>
+      </w:r>
+      <w:r>
+        <w:t xml:space="preserve"> </w:t>
+      </w:r>
+      <w:r>
+        <w:t>유의하시기</w:t>
+      </w:r>
+      <w:r>
+        <w:t xml:space="preserve"> </w:t>
+      </w:r>
+      <w:r>
+        <w:t>바랍니다</w:t>
+      </w:r>
+      <w:r>
+        <w:t>.</w:t>
       </w:r>
     </w:p>
     <w:p>
@@ -509,10 +1427,196 @@
           <w:bCs/>
           <w:u w:val="single"/>
         </w:rPr>
-        <w:t>발급된 계정은 6개월간 활동이력(이슈생성 또는 코멘트)</w:t>
-      </w:r>
-      <w:r>
-        <w:t xml:space="preserve"> 없을 경우 발급 취소할 예정(InActive 상태로 변경)이니 적극적인 활동 부탁 드립니다.</w:t>
+        <w:t>발급된</w:t>
+      </w:r>
+      <w:r>
+        <w:rPr>
+          <w:b/>
+          <w:bCs/>
+          <w:u w:val="single"/>
+        </w:rPr>
+        <w:t xml:space="preserve"> </w:t>
+      </w:r>
+      <w:r>
+        <w:rPr>
+          <w:b/>
+          <w:bCs/>
+          <w:u w:val="single"/>
+        </w:rPr>
+        <w:t>계정은</w:t>
+      </w:r>
+      <w:r>
+        <w:rPr>
+          <w:b/>
+          <w:bCs/>
+          <w:u w:val="single"/>
+        </w:rPr>
+        <w:t xml:space="preserve"> 6</w:t>
+      </w:r>
+      <w:r>
+        <w:rPr>
+          <w:b/>
+          <w:bCs/>
+          <w:u w:val="single"/>
+        </w:rPr>
+        <w:t>개월간</w:t>
+      </w:r>
+      <w:r>
+        <w:rPr>
+          <w:b/>
+          <w:bCs/>
+          <w:u w:val="single"/>
+        </w:rPr>
+        <w:t xml:space="preserve"> </w:t>
+      </w:r>
+      <w:r>
+        <w:rPr>
+          <w:b/>
+          <w:bCs/>
+          <w:u w:val="single"/>
+        </w:rPr>
+        <w:t>활동이력</w:t>
+      </w:r>
+      <w:r>
+        <w:rPr>
+          <w:b/>
+          <w:bCs/>
+          <w:u w:val="single"/>
+        </w:rPr>
+        <w:t>(</w:t>
+      </w:r>
+      <w:r>
+        <w:rPr>
+          <w:b/>
+          <w:bCs/>
+          <w:u w:val="single"/>
+        </w:rPr>
+        <w:t>이슈생성</w:t>
+      </w:r>
+      <w:r>
+        <w:rPr>
+          <w:b/>
+          <w:bCs/>
+          <w:u w:val="single"/>
+        </w:rPr>
+        <w:t xml:space="preserve"> </w:t>
+      </w:r>
+      <w:r>
+        <w:rPr>
+          <w:b/>
+          <w:bCs/>
+          <w:u w:val="single"/>
+        </w:rPr>
+        <w:t>또는</w:t>
+      </w:r>
+      <w:r>
+        <w:rPr>
+          <w:b/>
+          <w:bCs/>
+          <w:u w:val="single"/>
+        </w:rPr>
+        <w:t xml:space="preserve"> </w:t>
+      </w:r>
+      <w:r>
+        <w:rPr>
+          <w:b/>
+          <w:bCs/>
+          <w:u w:val="single"/>
+        </w:rPr>
+        <w:t>코멘트</w:t>
+      </w:r>
+      <w:r>
+        <w:rPr>
+          <w:b/>
+          <w:bCs/>
+          <w:u w:val="single"/>
+        </w:rPr>
+        <w:t>)</w:t>
+      </w:r>
+      <w:r>
+        <w:t xml:space="preserve"> </w:t>
+      </w:r>
+      <w:r>
+        <w:t>없을</w:t>
+      </w:r>
+      <w:r>
+        <w:t xml:space="preserve"> </w:t>
+      </w:r>
+      <w:r>
+        <w:t>경우</w:t>
+      </w:r>
+      <w:r>
+        <w:t xml:space="preserve"> </w:t>
+      </w:r>
+      <w:r>
+        <w:t>발급</w:t>
+      </w:r>
+      <w:r>
+        <w:t xml:space="preserve"> </w:t>
+      </w:r>
+      <w:r>
+        <w:t>취소할</w:t>
+      </w:r>
+      <w:r>
+        <w:t xml:space="preserve"> </w:t>
+      </w:r>
+      <w:r>
+        <w:t>예정</w:t>
+      </w:r>
+      <w:r>
+        <w:t>(</w:t>
+      </w:r>
+      <w:proofErr w:type="spellStart"/>
+      <w:r>
+        <w:t>InActive</w:t>
+      </w:r>
+      <w:proofErr w:type="spellEnd"/>
+      <w:r>
+        <w:t xml:space="preserve"> </w:t>
+      </w:r>
+      <w:r>
+        <w:t>상태로</w:t>
+      </w:r>
+      <w:r>
+        <w:t xml:space="preserve"> </w:t>
+      </w:r>
+      <w:r>
+        <w:t>변경</w:t>
+      </w:r>
+      <w:r>
+        <w:t>)</w:t>
+      </w:r>
+      <w:r>
+        <w:t>이니</w:t>
+      </w:r>
+      <w:r>
+        <w:t xml:space="preserve"> </w:t>
+      </w:r>
+      <w:r>
+        <w:t>적극적인</w:t>
+      </w:r>
+      <w:r>
+        <w:t xml:space="preserve"> </w:t>
+      </w:r>
+      <w:r>
+        <w:t>활동</w:t>
+      </w:r>
+      <w:r>
+        <w:t xml:space="preserve"> </w:t>
+      </w:r>
+      <w:proofErr w:type="gramStart"/>
+      <w:r>
+        <w:t>부탁</w:t>
+      </w:r>
+      <w:r>
+        <w:t xml:space="preserve"> </w:t>
+      </w:r>
+      <w:r>
+        <w:t>드립니다</w:t>
+      </w:r>
+      <w:proofErr w:type="gramEnd"/>
+      <w:r>
+        <w:t>.</w:t>
       </w:r>
     </w:p>
     <w:p>
@@ -521,7 +1625,42 @@
         <w:ind w:left="200"/>
       </w:pPr>
       <w:r>
-        <w:t>- InActive 상태로 변경된 계정은 평가 재</w:t>
+        <w:t xml:space="preserve">- </w:t>
+      </w:r>
+      <w:proofErr w:type="spellStart"/>
+      <w:r>
+        <w:t>InActive</w:t>
+      </w:r>
+      <w:proofErr w:type="spellEnd"/>
+      <w:r>
+        <w:t xml:space="preserve"> </w:t>
+      </w:r>
+      <w:r>
+        <w:t>상태로</w:t>
+      </w:r>
+      <w:r>
+        <w:t xml:space="preserve"> </w:t>
+      </w:r>
+      <w:r>
+        <w:t>변경된</w:t>
+      </w:r>
+      <w:r>
+        <w:t xml:space="preserve"> </w:t>
+      </w:r>
+      <w:r>
+        <w:t>계정은</w:t>
+      </w:r>
+      <w:r>
+        <w:t xml:space="preserve"> </w:t>
+      </w:r>
+      <w:r>
+        <w:t>평가</w:t>
+      </w:r>
+      <w:r>
+        <w:t xml:space="preserve"> </w:t>
+      </w:r>
+      <w:r>
+        <w:t>재</w:t>
       </w:r>
       <w:r>
         <w:rPr>
@@ -530,12 +1669,63 @@
         <w:t xml:space="preserve"> </w:t>
       </w:r>
       <w:r>
-        <w:t>응시가 필요합니다.</w:t>
+        <w:t>응시가</w:t>
+      </w:r>
+      <w:r>
+        <w:t xml:space="preserve"> </w:t>
+      </w:r>
+      <w:r>
+        <w:t>필요합니다</w:t>
+      </w:r>
+      <w:r>
+        <w:t>.</w:t>
       </w:r>
     </w:p>
     <w:p>
       <w:r>
-        <w:t xml:space="preserve">4. 처음에는 JIRA 사용 익숙하지 않아 낯설 것 같습니다. </w:t>
+        <w:t xml:space="preserve">4. </w:t>
+      </w:r>
+      <w:r>
+        <w:t>처음에는</w:t>
+      </w:r>
+      <w:r>
+        <w:t xml:space="preserve"> JIRA </w:t>
+      </w:r>
+      <w:r>
+        <w:t>사용</w:t>
+      </w:r>
+      <w:r>
+        <w:t xml:space="preserve"> </w:t>
+      </w:r>
+      <w:r>
+        <w:t>익숙하지</w:t>
+      </w:r>
+      <w:r>
+        <w:t xml:space="preserve"> </w:t>
+      </w:r>
+      <w:r>
+        <w:t>않아</w:t>
+      </w:r>
+      <w:r>
+        <w:t xml:space="preserve"> </w:t>
+      </w:r>
+      <w:r>
+        <w:t>낯설</w:t>
+      </w:r>
+      <w:r>
+        <w:t xml:space="preserve"> </w:t>
+      </w:r>
+      <w:r>
+        <w:t>것</w:t>
+      </w:r>
+      <w:r>
+        <w:t xml:space="preserve"> </w:t>
+      </w:r>
+      <w:r>
+        <w:t>같습니다</w:t>
+      </w:r>
+      <w:r>
+        <w:t xml:space="preserve">. </w:t>
       </w:r>
     </w:p>
     <w:p>
@@ -543,21 +1733,135 @@
         <w:spacing w:after="200"/>
       </w:pPr>
       <w:r>
-        <w:t>사용방법이나 활용법은 기존의 선배나 당사 제품을 먼</w:t>
-      </w:r>
-      <w:r>
-        <w:rPr>
-          <w:rFonts w:hint="eastAsia"/>
-        </w:rPr>
-        <w:t>저</w:t>
-      </w:r>
-      <w:r>
-        <w:t xml:space="preserve"> 지원한 내부 인원, 저희 직원들의 도움을 받아주세요. (TS-33070)</w:t>
+        <w:t>사용방법이나</w:t>
+      </w:r>
+      <w:r>
+        <w:t xml:space="preserve"> </w:t>
+      </w:r>
+      <w:r>
+        <w:t>활용법은</w:t>
+      </w:r>
+      <w:r>
+        <w:t xml:space="preserve"> </w:t>
+      </w:r>
+      <w:r>
+        <w:t>기존의</w:t>
+      </w:r>
+      <w:r>
+        <w:t xml:space="preserve"> </w:t>
+      </w:r>
+      <w:r>
+        <w:t>선배나</w:t>
+      </w:r>
+      <w:r>
+        <w:t xml:space="preserve"> </w:t>
+      </w:r>
+      <w:r>
+        <w:t>당사</w:t>
+      </w:r>
+      <w:r>
+        <w:t xml:space="preserve"> </w:t>
+      </w:r>
+      <w:r>
+        <w:t>제품을</w:t>
+      </w:r>
+      <w:r>
+        <w:t xml:space="preserve"> </w:t>
+      </w:r>
+      <w:r>
+        <w:t>먼지</w:t>
+      </w:r>
+      <w:r>
+        <w:t xml:space="preserve"> </w:t>
+      </w:r>
+      <w:r>
+        <w:t>지원한</w:t>
+      </w:r>
+      <w:r>
+        <w:t xml:space="preserve"> </w:t>
+      </w:r>
+      <w:r>
+        <w:t>내부</w:t>
+      </w:r>
+      <w:r>
+        <w:t xml:space="preserve"> </w:t>
+      </w:r>
+      <w:r>
+        <w:t>인원</w:t>
+      </w:r>
+      <w:r>
+        <w:t xml:space="preserve">, </w:t>
+      </w:r>
+      <w:r>
+        <w:t>저희</w:t>
+      </w:r>
+      <w:r>
+        <w:t xml:space="preserve"> </w:t>
+      </w:r>
+      <w:r>
+        <w:t>직원들의</w:t>
+      </w:r>
+      <w:r>
+        <w:t xml:space="preserve"> </w:t>
+      </w:r>
+      <w:r>
+        <w:t>도움을</w:t>
+      </w:r>
+      <w:r>
+        <w:t xml:space="preserve"> </w:t>
+      </w:r>
+      <w:r>
+        <w:t>받아주세요</w:t>
+      </w:r>
+      <w:r>
+        <w:t>. (TS-33070)</w:t>
       </w:r>
     </w:p>
     <w:p>
       <w:r>
-        <w:t>5. JIRA를 통해 공지되는 사항들은 반드시 이행하여 주십시오.</w:t>
+        <w:t>5. JIRA</w:t>
+      </w:r>
+      <w:r>
+        <w:t>를</w:t>
+      </w:r>
+      <w:r>
+        <w:t xml:space="preserve"> </w:t>
+      </w:r>
+      <w:r>
+        <w:t>통해</w:t>
+      </w:r>
+      <w:r>
+        <w:t xml:space="preserve"> </w:t>
+      </w:r>
+      <w:r>
+        <w:t>공지되는</w:t>
+      </w:r>
+      <w:r>
+        <w:t xml:space="preserve"> </w:t>
+      </w:r>
+      <w:r>
+        <w:t>사항들은</w:t>
+      </w:r>
+      <w:r>
+        <w:t xml:space="preserve"> </w:t>
+      </w:r>
+      <w:r>
+        <w:t>반드시</w:t>
+      </w:r>
+      <w:r>
+        <w:t xml:space="preserve"> </w:t>
+      </w:r>
+      <w:r>
+        <w:t>이행하여</w:t>
+      </w:r>
+      <w:r>
+        <w:t xml:space="preserve"> </w:t>
+      </w:r>
+      <w:r>
+        <w:t>주십시오</w:t>
+      </w:r>
+      <w:r>
+        <w:t>.</w:t>
       </w:r>
     </w:p>
     <w:p>
@@ -565,7 +1869,42 @@
         <w:spacing w:after="200"/>
       </w:pPr>
       <w:r>
-        <w:t>- 기존 공지들도 확인 부탁 드립니다.</w:t>
+        <w:t xml:space="preserve">- </w:t>
+      </w:r>
+      <w:r>
+        <w:t>기</w:t>
+      </w:r>
+      <w:r>
+        <w:t>존</w:t>
+      </w:r>
+      <w:r>
+        <w:t xml:space="preserve"> </w:t>
+      </w:r>
+      <w:r>
+        <w:t>공지들도</w:t>
+      </w:r>
+      <w:r>
+        <w:t xml:space="preserve"> </w:t>
+      </w:r>
+      <w:r>
+        <w:t>확인</w:t>
+      </w:r>
+      <w:r>
+        <w:t xml:space="preserve"> </w:t>
+      </w:r>
+      <w:proofErr w:type="gramStart"/>
+      <w:r>
+        <w:t>부탁</w:t>
+      </w:r>
+      <w:r>
+        <w:t xml:space="preserve"> </w:t>
+      </w:r>
+      <w:r>
+        <w:t>드립니다</w:t>
+      </w:r>
+      <w:proofErr w:type="gramEnd"/>
+      <w:r>
+        <w:t>.</w:t>
       </w:r>
     </w:p>
     <w:p>
@@ -573,7 +1912,43 @@
         <w:spacing w:after="200"/>
       </w:pPr>
       <w:r>
-        <w:t xml:space="preserve">6. PR파트너사는 회사메일을 통해 SLACK 초대 메시지가 발송됩니다. </w:t>
+        <w:t>6. PR</w:t>
+      </w:r>
+      <w:r>
+        <w:t>파트너사는</w:t>
+      </w:r>
+      <w:r>
+        <w:t xml:space="preserve"> </w:t>
+      </w:r>
+      <w:r>
+        <w:t>회사메일을</w:t>
+      </w:r>
+      <w:r>
+        <w:t xml:space="preserve"> </w:t>
+      </w:r>
+      <w:r>
+        <w:t>통해</w:t>
+      </w:r>
+      <w:r>
+        <w:t xml:space="preserve"> SLACK </w:t>
+      </w:r>
+      <w:r>
+        <w:t>초대</w:t>
+      </w:r>
+      <w:r>
+        <w:t xml:space="preserve"> </w:t>
+      </w:r>
+      <w:r>
+        <w:t>메시지가</w:t>
+      </w:r>
+      <w:r>
+        <w:t xml:space="preserve"> </w:t>
+      </w:r>
+      <w:r>
+        <w:t>발송됩니다</w:t>
+      </w:r>
+      <w:r>
+        <w:t xml:space="preserve">. </w:t>
       </w:r>
     </w:p>
     <w:p>
@@ -581,17 +1956,71 @@
         <w:spacing w:after="200"/>
       </w:pPr>
       <w:r>
-        <w:t xml:space="preserve">7. 첨부해드리는 </w:t>
-      </w:r>
-      <w:r>
-        <w:rPr>
-          <w:b/>
-          <w:bCs/>
-        </w:rPr>
-        <w:t>이슈관리시스템 문서를 반드시 숙지</w:t>
-      </w:r>
-      <w:r>
-        <w:t>하시고 이용해</w:t>
+        <w:t xml:space="preserve">7. </w:t>
+      </w:r>
+      <w:r>
+        <w:t>첨부해드리는</w:t>
+      </w:r>
+      <w:r>
+        <w:t xml:space="preserve"> </w:t>
+      </w:r>
+      <w:r>
+        <w:rPr>
+          <w:b/>
+          <w:bCs/>
+        </w:rPr>
+        <w:t>이슈관리시스템</w:t>
+      </w:r>
+      <w:r>
+        <w:rPr>
+          <w:b/>
+          <w:bCs/>
+        </w:rPr>
+        <w:t xml:space="preserve"> </w:t>
+      </w:r>
+      <w:r>
+        <w:rPr>
+          <w:b/>
+          <w:bCs/>
+        </w:rPr>
+        <w:t>문서를</w:t>
+      </w:r>
+      <w:r>
+        <w:rPr>
+          <w:b/>
+          <w:bCs/>
+        </w:rPr>
+        <w:t xml:space="preserve"> </w:t>
+      </w:r>
+      <w:r>
+        <w:rPr>
+          <w:b/>
+          <w:bCs/>
+        </w:rPr>
+        <w:t>반드시</w:t>
+      </w:r>
+      <w:r>
+        <w:rPr>
+          <w:b/>
+          <w:bCs/>
+        </w:rPr>
+        <w:t xml:space="preserve"> </w:t>
+      </w:r>
+      <w:r>
+        <w:rPr>
+          <w:b/>
+          <w:bCs/>
+        </w:rPr>
+        <w:t>숙지</w:t>
+      </w:r>
+      <w:r>
+        <w:t>하시고</w:t>
+      </w:r>
+      <w:r>
+        <w:t xml:space="preserve"> </w:t>
+      </w:r>
+      <w:r>
+        <w:t>이용해</w:t>
       </w:r>
       <w:r>
         <w:rPr>
@@ -600,12 +2029,54 @@
         <w:t xml:space="preserve"> </w:t>
       </w:r>
       <w:r>
-        <w:t>주시기바랍니다.</w:t>
+        <w:t>주시기바랍니다</w:t>
+      </w:r>
+      <w:r>
+        <w:t>.</w:t>
       </w:r>
     </w:p>
     <w:p>
       <w:r>
-        <w:t>추가 문의사항이 있으신 경우 Slack #education 채널로 문의 부탁드립니다.</w:t>
+        <w:t>추가</w:t>
+      </w:r>
+      <w:r>
+        <w:t xml:space="preserve"> </w:t>
+      </w:r>
+      <w:r>
+        <w:t>문의사항이</w:t>
+      </w:r>
+      <w:r>
+        <w:t xml:space="preserve"> </w:t>
+      </w:r>
+      <w:r>
+        <w:t>있으신</w:t>
+      </w:r>
+      <w:r>
+        <w:t xml:space="preserve"> </w:t>
+      </w:r>
+      <w:r>
+        <w:t>경우</w:t>
+      </w:r>
+      <w:r>
+        <w:t xml:space="preserve"> Slack #education </w:t>
+      </w:r>
+      <w:r>
+        <w:t>채널로</w:t>
+      </w:r>
+      <w:r>
+        <w:t xml:space="preserve"> </w:t>
+      </w:r>
+      <w:r>
+        <w:t>문의</w:t>
+      </w:r>
+      <w:r>
+        <w:t xml:space="preserve"> </w:t>
+      </w:r>
+      <w:r>
+        <w:t>부탁드립니다</w:t>
+      </w:r>
+      <w:r>
+        <w:t>.</w:t>
       </w:r>
     </w:p>
     <w:sectPr>

</xml_diff>